<commit_message>
fix(dispatch): stop inspector flood, clear 2844 stale pending, give Claude approval authority
- inspector.file_dispatch() now idempotent: one open dispatch per (project_id,check_id),
  refreshed in place instead of a fresh pending row every 4h run
- dashboard render_dispatch() excludes inspector/compliance from the CoWork human-review
  queue; routed to /compliance with an inline pointer
- bulk-resolved 2844 stale inspector pending dispatches (resolved, not approved -> no
  apply-pipeline runs); CoWork Dispatch board now shows 0 of 0
- new tools/dispatch_admin.py: Claude/Renne approve|decline|resolve|clean-inspector via Brain API

Co-Authored-By: Claude Opus 4.8 <noreply@anthropic.com>
</commit_message>
<xml_diff>
--- a/hive/DOCUMENTATION/Claude_Manager_Implementation_Log.docx
+++ b/hive/DOCUMENTATION/Claude_Manager_Implementation_Log.docx
@@ -196,6 +196,87 @@
       </w:r>
     </w:p>
     <w:p/>
+    <w:p>
+      <w:pPr>
+        <w:pStyle w:val="Heading1"/>
+      </w:pPr>
+      <w:r>
+        <w:t>Implementation Log — 2026-06-17 14:31</w:t>
+      </w:r>
+    </w:p>
+    <w:p>
+      <w:r>
+        <w:rPr>
+          <w:b/>
+          <w:sz w:val="24"/>
+        </w:rPr>
+        <w:t>CoWork Dispatch — Pending queue cleanup &amp; Claude approval authority</w:t>
+      </w:r>
+    </w:p>
+    <w:p>
+      <w:pPr>
+        <w:pStyle w:val="ListBullet"/>
+      </w:pPr>
+      <w:r>
+        <w:t>Diagnosed the never-emptying 'Pending — Awaiting Review' box on the CoWork Dispatch board: 2,844 pending dispatches, all hive_inspector compliance findings collapsing to ~29 distinct issues.</w:t>
+      </w:r>
+    </w:p>
+    <w:p>
+      <w:pPr>
+        <w:pStyle w:val="ListBullet"/>
+      </w:pPr>
+      <w:r>
+        <w:t>Root cause: inspector file_dispatch() inserted a brand-new pending dispatch for the same (project_id, check_id) on every 4-hour run with no dedup, and never resolved old ones.</w:t>
+      </w:r>
+    </w:p>
+    <w:p>
+      <w:pPr>
+        <w:pStyle w:val="ListBullet"/>
+      </w:pPr>
+      <w:r>
+        <w:t>Confirmed Renne's genuine CoWork approvals had succeeded — zero real CoWork/Renne/Claude items were stuck.</w:t>
+      </w:r>
+    </w:p>
+    <w:p>
+      <w:pPr>
+        <w:pStyle w:val="ListBullet"/>
+      </w:pPr>
+      <w:r>
+        <w:t>Fix 1: made inspector.file_dispatch() idempotent — one open dispatch per project+check, refreshed in place instead of duplicated. Verified by unit test (same id returned, single row, payload refreshed).</w:t>
+      </w:r>
+    </w:p>
+    <w:p>
+      <w:pPr>
+        <w:pStyle w:val="ListBullet"/>
+      </w:pPr>
+      <w:r>
+        <w:t>Fix 2: bulk-resolved all 2,844 stale inspector dispatches (status='resolved', NOT 'approved', so no apply-pipeline runs were queued). Pending count now 0.</w:t>
+      </w:r>
+    </w:p>
+    <w:p>
+      <w:pPr>
+        <w:pStyle w:val="ListBullet"/>
+      </w:pPr>
+      <w:r>
+        <w:t>Fix 3: dashboard render_dispatch() now excludes inspector/compliance from the CoWork human-review queue; they are routed to the /compliance board with an inline pointer. Board shows 'showing 0 of 0'.</w:t>
+      </w:r>
+    </w:p>
+    <w:p>
+      <w:pPr>
+        <w:pStyle w:val="ListBullet"/>
+      </w:pPr>
+      <w:r>
+        <w:t>Fix 4: created tools/dispatch_admin.py so Claude can approve/decline/resolve dispatches on Renne's behalf via the Brain API (approve triggers the real apply pipeline).</w:t>
+      </w:r>
+    </w:p>
+    <w:p>
+      <w:pPr>
+        <w:pStyle w:val="ListBullet"/>
+      </w:pPr>
+      <w:r>
+        <w:t>Restarted QI_Dashboard via the QI_Elevate broker (nssm restart required elevation).</w:t>
+      </w:r>
+    </w:p>
     <w:sectPr>
       <w:pgSz w:w="12240" w:h="15840"/>
       <w:pgMar w:top="1440" w:right="1800" w:bottom="1440" w:left="1800" w:header="720" w:footer="720" w:gutter="0"/>

</xml_diff>